<commit_message>
updated on sep 22th, 2025 @ 02:40pm
</commit_message>
<xml_diff>
--- a/Retreat an Concert Doc/Church_Retreat_Concert_Budget.docx
+++ b/Retreat an Concert Doc/Church_Retreat_Concert_Budget.docx
@@ -117,10 +117,7 @@
           </w:tcPr>
           <w:p>
             <w:r>
-              <w:t>H</w:t>
-            </w:r>
-            <w:r>
-              <w:t>ostel/rooms</w:t>
+              <w:t>Hostel/rooms</w:t>
             </w:r>
             <w:r>
               <w:t>/Church</w:t>
@@ -199,10 +196,7 @@
           </w:tcPr>
           <w:p>
             <w:r>
-              <w:t>5</w:t>
-            </w:r>
-            <w:r>
-              <w:t>00,000 – 2,250,000</w:t>
+              <w:t>500,000 – 2,250,000</w:t>
             </w:r>
           </w:p>
         </w:tc>
@@ -226,6 +220,11 @@
             <w:r>
               <w:t>Bus hire, fueling, logistics</w:t>
             </w:r>
+            <w:r>
+              <w:t>=</w:t>
+            </w:r>
+            <w:bookmarkStart w:id="0" w:name="_GoBack"/>
+            <w:bookmarkEnd w:id="0"/>
           </w:p>
         </w:tc>
         <w:tc>
@@ -372,18 +371,13 @@
       <w:r>
         <w:t>Subtotal (Retreat): ₦1.2m – ₦4.4m</w:t>
       </w:r>
-      <w:bookmarkStart w:id="0" w:name="_GoBack"/>
-      <w:bookmarkEnd w:id="0"/>
     </w:p>
     <w:p>
       <w:pPr>
         <w:pStyle w:val="Heading1"/>
       </w:pPr>
       <w:r>
-        <w:t>🎶</w:t>
-      </w:r>
-      <w:r>
-        <w:t xml:space="preserve"> Concert Budget (1-Day Event)</w:t>
+        <w:t>🎶 Concert Budget (1-Day Event)</w:t>
       </w:r>
     </w:p>
     <w:tbl>
@@ -455,10 +449,7 @@
           </w:tcPr>
           <w:p>
             <w:r>
-              <w:t>150,000 – 500</w:t>
-            </w:r>
-            <w:r>
-              <w:t>,000</w:t>
+              <w:t>150,000 – 500,000</w:t>
             </w:r>
           </w:p>
         </w:tc>
@@ -576,10 +567,7 @@
           </w:tcPr>
           <w:p>
             <w:r>
-              <w:t xml:space="preserve">Posters, banners, online ads, </w:t>
-            </w:r>
-            <w:r>
-              <w:t>radio</w:t>
+              <w:t>Posters, banners, online ads, radio</w:t>
             </w:r>
           </w:p>
         </w:tc>
@@ -708,10 +696,7 @@
           </w:tcPr>
           <w:p>
             <w:r>
-              <w:t xml:space="preserve">Refreshments, </w:t>
-            </w:r>
-            <w:r>
-              <w:t>emergency, others</w:t>
+              <w:t>Refreshments, emergency, others</w:t>
             </w:r>
           </w:p>
         </w:tc>
@@ -737,10 +722,7 @@
         <w:pStyle w:val="Heading1"/>
       </w:pPr>
       <w:r>
-        <w:t>✅</w:t>
-      </w:r>
-      <w:r>
-        <w:t xml:space="preserve"> Combined Budget (Retreat + Concert)</w:t>
+        <w:t>✅ Combined Budget (Retreat + Concert)</w:t>
       </w:r>
     </w:p>
     <w:p>
@@ -12669,7 +12651,7 @@
 </file>
 
 <file path=customXml/itemProps1.xml><?xml version="1.0" encoding="utf-8"?>
-<ds:datastoreItem xmlns:ds="http://schemas.openxmlformats.org/officeDocument/2006/customXml" ds:itemID="{12C0CF87-4F55-4227-BC36-82460D9CBB52}">
+<ds:datastoreItem xmlns:ds="http://schemas.openxmlformats.org/officeDocument/2006/customXml" ds:itemID="{82E06B48-1695-4158-992C-96EF6119230E}">
   <ds:schemaRefs>
     <ds:schemaRef ds:uri="http://schemas.openxmlformats.org/officeDocument/2006/bibliography"/>
   </ds:schemaRefs>

</xml_diff>